<commit_message>
docs(manuals): add the follow-up variables and migrations 040 and 041 to the Spanish installation manual (4.5)
</commit_message>
<xml_diff>
--- a/09_MANUALES/ES/WORD/09_Manual_De_Instalacion.docx
+++ b/09_MANUALES/ES/WORD/09_Manual_De_Instalacion.docx
@@ -64,7 +64,7 @@
         <w:pStyle w:val="BodyText"/>
       </w:pPr>
       <w:r>
-        <w:t xml:space="preserve">20 de octubre de 2026</w:t>
+        <w:t xml:space="preserve">21 de octubre de 2026</w:t>
       </w:r>
     </w:p>
     <w:p>
@@ -72,7 +72,7 @@
         <w:pStyle w:val="BodyText"/>
       </w:pPr>
       <w:r>
-        <w:t xml:space="preserve">Tipo de manual: Manual de instalación (personal de infraestructura y DevOps) · Versión 4.3</w:t>
+        <w:t xml:space="preserve">Tipo de manual: Manual de instalación (personal de infraestructura y DevOps) · Versión 4.5</w:t>
       </w:r>
     </w:p>
     <w:bookmarkStart w:id="20" w:name="control-de-versiones"/>
@@ -608,6 +608,159 @@
           </w:p>
         </w:tc>
       </w:tr>
+      <w:tr>
+        <w:tc>
+          <w:tcPr/>
+          <w:p>
+            <w:pPr>
+              <w:pStyle w:val="Compact"/>
+            </w:pPr>
+            <w:r>
+              <w:t xml:space="preserve">4.4</w:t>
+            </w:r>
+          </w:p>
+        </w:tc>
+        <w:tc>
+          <w:tcPr/>
+          <w:p>
+            <w:pPr>
+              <w:pStyle w:val="Compact"/>
+            </w:pPr>
+            <w:r>
+              <w:t xml:space="preserve">2026-10-21</w:t>
+            </w:r>
+          </w:p>
+        </w:tc>
+        <w:tc>
+          <w:tcPr/>
+          <w:p>
+            <w:pPr>
+              <w:pStyle w:val="Compact"/>
+            </w:pPr>
+            <w:r>
+              <w:t xml:space="preserve">Revisión contra el código del 21 de octubre de 2026: variables opcionales del chequeo de sesión del gateway y del cierre de reservas vencidas (sección 10.2), semillas 110 a 112 de booking-service (sección 11.2), motivos de cancelación (Tabla 9), respaldos automáticos del servidor público (sección 11.6), verificación del token de una sesión cerrada (secciones 16.3 y 16.4) y errores nuevos (Tabla 14).</w:t>
+            </w:r>
+          </w:p>
+        </w:tc>
+        <w:tc>
+          <w:tcPr/>
+          <w:p>
+            <w:pPr>
+              <w:pStyle w:val="Compact"/>
+            </w:pPr>
+            <w:r>
+              <w:t xml:space="preserve">Equipo de desarrollo</w:t>
+            </w:r>
+          </w:p>
+        </w:tc>
+      </w:tr>
+      <w:tr>
+        <w:tc>
+          <w:tcPr/>
+          <w:p>
+            <w:pPr>
+              <w:pStyle w:val="Compact"/>
+            </w:pPr>
+            <w:r>
+              <w:t xml:space="preserve">4.5</w:t>
+            </w:r>
+          </w:p>
+        </w:tc>
+        <w:tc>
+          <w:tcPr/>
+          <w:p>
+            <w:pPr>
+              <w:pStyle w:val="Compact"/>
+            </w:pPr>
+            <w:r>
+              <w:t xml:space="preserve">2026-10-21</w:t>
+            </w:r>
+          </w:p>
+        </w:tc>
+        <w:tc>
+          <w:tcPr/>
+          <w:p>
+            <w:pPr>
+              <w:pStyle w:val="Compact"/>
+            </w:pPr>
+            <w:r>
+              <w:t xml:space="preserve">Cambio de la regla de las reservas que terminan sin cerrarse, revisada por el equipo la noche del 21 de octubre: booking-service solo cancela las programadas vencidas y operations-service revisa las confirmadas y las iniciadas. Se agregaron las variables</w:t>
+            </w:r>
+            <w:r>
+              <w:t xml:space="preserve"> </w:t>
+            </w:r>
+            <w:r>
+              <w:rPr>
+                <w:i/>
+                <w:iCs/>
+              </w:rPr>
+              <w:t xml:space="preserve">FOLLOW_UP_ENABLED</w:t>
+            </w:r>
+            <w:r>
+              <w:t xml:space="preserve"> </w:t>
+            </w:r>
+            <w:r>
+              <w:t xml:space="preserve">y</w:t>
+            </w:r>
+            <w:r>
+              <w:t xml:space="preserve"> </w:t>
+            </w:r>
+            <w:r>
+              <w:rPr>
+                <w:i/>
+                <w:iCs/>
+              </w:rPr>
+              <w:t xml:space="preserve">FOLLOW_UP_INTERVAL</w:t>
+            </w:r>
+            <w:r>
+              <w:t xml:space="preserve">,</w:t>
+            </w:r>
+            <w:r>
+              <w:t xml:space="preserve"> </w:t>
+            </w:r>
+            <w:r>
+              <w:rPr>
+                <w:i/>
+                <w:iCs/>
+              </w:rPr>
+              <w:t xml:space="preserve">BOOKING_EXPIRY_GRACE_MINUTES</w:t>
+            </w:r>
+            <w:r>
+              <w:t xml:space="preserve"> </w:t>
+            </w:r>
+            <w:r>
+              <w:t xml:space="preserve">compartida por booking-service y operations-service, y los servicios que usan</w:t>
+            </w:r>
+            <w:r>
+              <w:t xml:space="preserve"> </w:t>
+            </w:r>
+            <w:r>
+              <w:rPr>
+                <w:i/>
+                <w:iCs/>
+              </w:rPr>
+              <w:t xml:space="preserve">INTERNAL_API_KEY</w:t>
+            </w:r>
+            <w:r>
+              <w:t xml:space="preserve"> </w:t>
+            </w:r>
+            <w:r>
+              <w:t xml:space="preserve">(sección 10.2); changelogs 040 de operations-service y 041 de notification-service (sección 11.2); 26 tipos de notificación (Tabla 9); verificación de la tarjeta "Por cerrar" (sección 16.4); un error nuevo (Tabla 14) y el Anexo B.</w:t>
+            </w:r>
+          </w:p>
+        </w:tc>
+        <w:tc>
+          <w:tcPr/>
+          <w:p>
+            <w:pPr>
+              <w:pStyle w:val="Compact"/>
+            </w:pPr>
+            <w:r>
+              <w:t xml:space="preserve">Equipo de desarrollo</w:t>
+            </w:r>
+          </w:p>
+        </w:tc>
+      </w:tr>
     </w:tbl>
     <w:p>
       <w:pPr>
@@ -1916,7 +2069,7 @@
         <w:t xml:space="preserve"> </w:t>
       </w:r>
       <w:r>
-        <w:t xml:space="preserve">al 17 de octubre de 2026) y la documentación del proyecto actualizada a esa misma fecha (Equipo de Desarrollo Vehicle Washing, 2026a, 2026b). Los valores que dependen de cada instalación (contraseñas, llaves y direcciones) se escriben entre ángulos, como</w:t>
+        <w:t xml:space="preserve">al 21 de octubre de 2026) y la documentación del proyecto actualizada a esa misma fecha (Equipo de Desarrollo Vehicle Washing, 2026a, 2026b). Los valores que dependen de cada instalación (contraseñas, llaves y direcciones) se escriben entre ángulos, como</w:t>
       </w:r>
       <w:r>
         <w:t xml:space="preserve"> </w:t>
@@ -6979,18 +7132,18 @@
               <w:pStyle w:val="Compact"/>
             </w:pPr>
             <w:r>
-              <w:t xml:space="preserve">security-service y notification-service</w:t>
-            </w:r>
-          </w:p>
-        </w:tc>
-        <w:tc>
-          <w:tcPr/>
-          <w:p>
-            <w:pPr>
-              <w:pStyle w:val="Compact"/>
-            </w:pPr>
-            <w:r>
-              <w:t xml:space="preserve">Llave de las rutas internas; sin ella no se envían por correo los avisos de reservas, pagos y cupones ni los recordatorios, y no se pueden leer los interruptores de notificación de cada usuario.</w:t>
+              <w:t xml:space="preserve">security-service, booking-service, operations-service y notification-service</w:t>
+            </w:r>
+          </w:p>
+        </w:tc>
+        <w:tc>
+          <w:tcPr/>
+          <w:p>
+            <w:pPr>
+              <w:pStyle w:val="Compact"/>
+            </w:pPr>
+            <w:r>
+              <w:t xml:space="preserve">Llave de las rutas internas; sin ella no se envían por correo los avisos de reservas, pagos y cupones ni los recordatorios, no se pueden leer los interruptores de notificación de cada usuario y operations-service no puede cerrar como No asistió las reservas confirmadas que terminaron sin operario.</w:t>
             </w:r>
           </w:p>
         </w:tc>
@@ -7077,6 +7230,313 @@
             </w:pPr>
             <w:r>
               <w:t xml:space="preserve">America/Bogota, 30 y 60 por defecto.</w:t>
+            </w:r>
+          </w:p>
+        </w:tc>
+      </w:tr>
+      <w:tr>
+        <w:tc>
+          <w:tcPr/>
+          <w:p>
+            <w:pPr>
+              <w:pStyle w:val="Compact"/>
+            </w:pPr>
+            <w:r>
+              <w:t xml:space="preserve">SESSION_CHECK_ENABLED, SESSION_CHECK_CACHE_TTL, SESSION_CHECK_TIMEOUT</w:t>
+            </w:r>
+          </w:p>
+        </w:tc>
+        <w:tc>
+          <w:tcPr/>
+          <w:p>
+            <w:pPr>
+              <w:pStyle w:val="Compact"/>
+            </w:pPr>
+            <w:r>
+              <w:t xml:space="preserve">api-gateway</w:t>
+            </w:r>
+          </w:p>
+        </w:tc>
+        <w:tc>
+          <w:tcPr/>
+          <w:p>
+            <w:pPr>
+              <w:pStyle w:val="Compact"/>
+            </w:pPr>
+            <w:r>
+              <w:t xml:space="preserve">Chequeo de la sesión del token (desde el 21 de octubre de 2026):</w:t>
+            </w:r>
+            <w:r>
+              <w:t xml:space="preserve"> </w:t>
+            </w:r>
+            <w:r>
+              <w:rPr>
+                <w:i/>
+                <w:iCs/>
+              </w:rPr>
+              <w:t xml:space="preserve">true</w:t>
+            </w:r>
+            <w:r>
+              <w:t xml:space="preserve">,</w:t>
+            </w:r>
+            <w:r>
+              <w:t xml:space="preserve"> </w:t>
+            </w:r>
+            <w:r>
+              <w:rPr>
+                <w:i/>
+                <w:iCs/>
+              </w:rPr>
+              <w:t xml:space="preserve">30s</w:t>
+            </w:r>
+            <w:r>
+              <w:t xml:space="preserve"> </w:t>
+            </w:r>
+            <w:r>
+              <w:t xml:space="preserve">y</w:t>
+            </w:r>
+            <w:r>
+              <w:t xml:space="preserve"> </w:t>
+            </w:r>
+            <w:r>
+              <w:rPr>
+                <w:i/>
+                <w:iCs/>
+              </w:rPr>
+              <w:t xml:space="preserve">3s</w:t>
+            </w:r>
+            <w:r>
+              <w:t xml:space="preserve"> </w:t>
+            </w:r>
+            <w:r>
+              <w:t xml:space="preserve">por defecto. No están en</w:t>
+            </w:r>
+            <w:r>
+              <w:t xml:space="preserve"> </w:t>
+            </w:r>
+            <w:r>
+              <w:rPr>
+                <w:i/>
+                <w:iCs/>
+              </w:rPr>
+              <w:t xml:space="preserve">.env.example</w:t>
+            </w:r>
+            <w:r>
+              <w:t xml:space="preserve"> </w:t>
+            </w:r>
+            <w:r>
+              <w:t xml:space="preserve">ni en el archivo de Compose: en Docker quedan con su valor por defecto y solo cambian si el gateway corre desde el IDE (acción ACO-14).</w:t>
+            </w:r>
+          </w:p>
+        </w:tc>
+      </w:tr>
+      <w:tr>
+        <w:tc>
+          <w:tcPr/>
+          <w:p>
+            <w:pPr>
+              <w:pStyle w:val="Compact"/>
+            </w:pPr>
+            <w:r>
+              <w:t xml:space="preserve">BOOKING_EXPIRY_CHECK_ENABLED, BOOKING_EXPIRY_CHECK_INTERVAL</w:t>
+            </w:r>
+          </w:p>
+        </w:tc>
+        <w:tc>
+          <w:tcPr/>
+          <w:p>
+            <w:pPr>
+              <w:pStyle w:val="Compact"/>
+            </w:pPr>
+            <w:r>
+              <w:t xml:space="preserve">booking-service</w:t>
+            </w:r>
+          </w:p>
+        </w:tc>
+        <w:tc>
+          <w:tcPr/>
+          <w:p>
+            <w:pPr>
+              <w:pStyle w:val="Compact"/>
+            </w:pPr>
+            <w:r>
+              <w:t xml:space="preserve">Cancelación automática de las reservas programadas que nunca se confirmaron (motivo</w:t>
+            </w:r>
+            <w:r>
+              <w:t xml:space="preserve"> </w:t>
+            </w:r>
+            <w:r>
+              <w:rPr>
+                <w:i/>
+                <w:iCs/>
+              </w:rPr>
+              <w:t xml:space="preserve">EXPIRED</w:t>
+            </w:r>
+            <w:r>
+              <w:t xml:space="preserve">):</w:t>
+            </w:r>
+            <w:r>
+              <w:t xml:space="preserve"> </w:t>
+            </w:r>
+            <w:r>
+              <w:rPr>
+                <w:i/>
+                <w:iCs/>
+              </w:rPr>
+              <w:t xml:space="preserve">true</w:t>
+            </w:r>
+            <w:r>
+              <w:t xml:space="preserve"> </w:t>
+            </w:r>
+            <w:r>
+              <w:t xml:space="preserve">y</w:t>
+            </w:r>
+            <w:r>
+              <w:t xml:space="preserve"> </w:t>
+            </w:r>
+            <w:r>
+              <w:rPr>
+                <w:i/>
+                <w:iCs/>
+              </w:rPr>
+              <w:t xml:space="preserve">PT5M</w:t>
+            </w:r>
+            <w:r>
+              <w:t xml:space="preserve"> </w:t>
+            </w:r>
+            <w:r>
+              <w:t xml:space="preserve">(cada 5 minutos) por defecto. Igual que las anteriores, no pasan por el archivo de Compose.</w:t>
+            </w:r>
+          </w:p>
+        </w:tc>
+      </w:tr>
+      <w:tr>
+        <w:tc>
+          <w:tcPr/>
+          <w:p>
+            <w:pPr>
+              <w:pStyle w:val="Compact"/>
+            </w:pPr>
+            <w:r>
+              <w:t xml:space="preserve">BOOKING_EXPIRY_GRACE_MINUTES</w:t>
+            </w:r>
+          </w:p>
+        </w:tc>
+        <w:tc>
+          <w:tcPr/>
+          <w:p>
+            <w:pPr>
+              <w:pStyle w:val="Compact"/>
+            </w:pPr>
+            <w:r>
+              <w:t xml:space="preserve">booking-service y operations-service</w:t>
+            </w:r>
+          </w:p>
+        </w:tc>
+        <w:tc>
+          <w:tcPr/>
+          <w:p>
+            <w:pPr>
+              <w:pStyle w:val="Compact"/>
+            </w:pPr>
+            <w:r>
+              <w:t xml:space="preserve">Minutos después de la hora de fin antes de cerrar una reserva vencida;</w:t>
+            </w:r>
+            <w:r>
+              <w:t xml:space="preserve"> </w:t>
+            </w:r>
+            <w:r>
+              <w:rPr>
+                <w:i/>
+                <w:iCs/>
+              </w:rPr>
+              <w:t xml:space="preserve">60</w:t>
+            </w:r>
+            <w:r>
+              <w:t xml:space="preserve"> </w:t>
+            </w:r>
+            <w:r>
+              <w:t xml:space="preserve">por defecto. La usan los dos servicios, así que si se cambia debe tener el mismo valor en ambos. No pasa por el archivo de Compose.</w:t>
+            </w:r>
+          </w:p>
+        </w:tc>
+      </w:tr>
+      <w:tr>
+        <w:tc>
+          <w:tcPr/>
+          <w:p>
+            <w:pPr>
+              <w:pStyle w:val="Compact"/>
+            </w:pPr>
+            <w:r>
+              <w:t xml:space="preserve">FOLLOW_UP_ENABLED, FOLLOW_UP_INTERVAL</w:t>
+            </w:r>
+          </w:p>
+        </w:tc>
+        <w:tc>
+          <w:tcPr/>
+          <w:p>
+            <w:pPr>
+              <w:pStyle w:val="Compact"/>
+            </w:pPr>
+            <w:r>
+              <w:t xml:space="preserve">operations-service</w:t>
+            </w:r>
+          </w:p>
+        </w:tc>
+        <w:tc>
+          <w:tcPr/>
+          <w:p>
+            <w:pPr>
+              <w:pStyle w:val="Compact"/>
+            </w:pPr>
+            <w:r>
+              <w:t xml:space="preserve">Revisión de las reservas que terminaron sin cerrarse (desde la noche del 21 de octubre de 2026): pasa a No asistió la confirmada que nunca tuvo operario y deja en "Por cerrar" la que tenía operario y nadie registró.</w:t>
+            </w:r>
+            <w:r>
+              <w:t xml:space="preserve"> </w:t>
+            </w:r>
+            <w:r>
+              <w:rPr>
+                <w:i/>
+                <w:iCs/>
+              </w:rPr>
+              <w:t xml:space="preserve">true</w:t>
+            </w:r>
+            <w:r>
+              <w:t xml:space="preserve"> </w:t>
+            </w:r>
+            <w:r>
+              <w:t xml:space="preserve">y</w:t>
+            </w:r>
+            <w:r>
+              <w:t xml:space="preserve"> </w:t>
+            </w:r>
+            <w:r>
+              <w:rPr>
+                <w:i/>
+                <w:iCs/>
+              </w:rPr>
+              <w:t xml:space="preserve">PT5M</w:t>
+            </w:r>
+            <w:r>
+              <w:t xml:space="preserve"> </w:t>
+            </w:r>
+            <w:r>
+              <w:t xml:space="preserve">por defecto; necesita</w:t>
+            </w:r>
+            <w:r>
+              <w:t xml:space="preserve"> </w:t>
+            </w:r>
+            <w:r>
+              <w:rPr>
+                <w:i/>
+                <w:iCs/>
+              </w:rPr>
+              <w:t xml:space="preserve">INTERNAL_API_KEY</w:t>
+            </w:r>
+            <w:r>
+              <w:t xml:space="preserve">. No pasan por el archivo de Compose.</w:t>
             </w:r>
           </w:p>
         </w:tc>
@@ -8757,7 +9217,7 @@
         <w:t xml:space="preserve"> </w:t>
       </w:r>
       <w:r>
-        <w:t xml:space="preserve">se crean la primera vez que arranca cada servicio (sección 12). La Tabla 8 muestra los changelogs de la versión del 16 de octubre de 2026.</w:t>
+        <w:t xml:space="preserve">se crean la primera vez que arranca cada servicio (sección 12). La Tabla 8 muestra los changelogs de la versión del 21 de octubre de 2026.</w:t>
       </w:r>
     </w:p>
     <w:p>
@@ -8922,7 +9382,23 @@
               <w:pStyle w:val="Compact"/>
             </w:pPr>
             <w:r>
-              <w:t xml:space="preserve">005 esquemas de catálogo y reservas, 018 cambios de ADR-010, 021 historial del horario, 022 puntos de fidelización del catálogo, 024 retiro del operario de la bahía, 032 datos del negocio del establecimiento; semillas 103 catálogo, 104 estados y motivos, 109 establecimiento, horario y cuatro bahías.</w:t>
+              <w:t xml:space="preserve">005 esquemas de catálogo y reservas, 018 cambios de ADR-010, 021 historial del horario, 022 puntos de fidelización del catálogo, 024 retiro del operario de la bahía, 032 datos del negocio del establecimiento; semillas 103 catálogo, 104 estados y motivos, 109 establecimiento, horario y cuatro bahías, 110 datos del negocio, 111 borrado de los datos de ejemplo del negocio para que el negocio real los complete y 112 motivo</w:t>
+            </w:r>
+            <w:r>
+              <w:t xml:space="preserve"> </w:t>
+            </w:r>
+            <w:r>
+              <w:rPr>
+                <w:i/>
+                <w:iCs/>
+              </w:rPr>
+              <w:t xml:space="preserve">EXPIRED</w:t>
+            </w:r>
+            <w:r>
+              <w:t xml:space="preserve"> </w:t>
+            </w:r>
+            <w:r>
+              <w:t xml:space="preserve">del cierre automático de reservas vencidas.</w:t>
             </w:r>
           </w:p>
         </w:tc>
@@ -8957,7 +9433,17 @@
               <w:pStyle w:val="Compact"/>
             </w:pPr>
             <w:r>
-              <w:t xml:space="preserve">007 esquema de ejecución, 033 informes de inspección con fases, hallazgos y fotos, 037 perfil del operario; semilla 105 estados de ejecución.</w:t>
+              <w:t xml:space="preserve">007 esquema de ejecución, 033 informes de inspección con fases, hallazgos y fotos, 037 perfil del operario, 040 hora del aviso de servicio sin registrar (</w:t>
+            </w:r>
+            <w:r>
+              <w:rPr>
+                <w:i/>
+                <w:iCs/>
+              </w:rPr>
+              <w:t xml:space="preserve">follow_up_notice_at</w:t>
+            </w:r>
+            <w:r>
+              <w:t xml:space="preserve">); semilla 105 estados de ejecución.</w:t>
             </w:r>
           </w:p>
         </w:tc>
@@ -8992,7 +9478,7 @@
               <w:pStyle w:val="Compact"/>
             </w:pPr>
             <w:r>
-              <w:t xml:space="preserve">010 esquema de notificaciones, 016 tokens de dispositivos, 017 eventos procesados, 019 recordatorios de reservas, 025 tipo de cupón canjeado, 027 notificaciones al personal y seguimiento de reservas, 028 tipo de pago reembolsado, 029 tipos de puntos e inspección, 031 aviso de reserva sin operario, 038 tipo de aviso de versión nueva de la app; semilla 108 tipos de notificación.</w:t>
+              <w:t xml:space="preserve">010 esquema de notificaciones, 016 tokens de dispositivos, 017 eventos procesados, 019 recordatorios de reservas, 025 tipo de cupón canjeado, 027 notificaciones al personal y seguimiento de reservas, 028 tipo de pago reembolsado, 029 tipos de puntos e inspección, 031 aviso de reserva sin operario, 038 tipo de aviso de versión nueva de la app, 041 tipos de aviso de servicio sin registrar para el operario y el administrador; semilla 108 tipos de notificación.</w:t>
             </w:r>
           </w:p>
         </w:tc>
@@ -10661,18 +11147,34 @@
               <w:pStyle w:val="Compact"/>
             </w:pPr>
             <w:r>
-              <w:t xml:space="preserve">booking.service_bay</w:t>
-            </w:r>
-          </w:p>
-        </w:tc>
-        <w:tc>
-          <w:tcPr/>
-          <w:p>
-            <w:pPr>
-              <w:pStyle w:val="Compact"/>
-            </w:pPr>
-            <w:r>
-              <w:t xml:space="preserve">4 bahías.</w:t>
+              <w:t xml:space="preserve">booking.cancellation_reason</w:t>
+            </w:r>
+          </w:p>
+        </w:tc>
+        <w:tc>
+          <w:tcPr/>
+          <w:p>
+            <w:pPr>
+              <w:pStyle w:val="Compact"/>
+            </w:pPr>
+            <w:r>
+              <w:t xml:space="preserve">7 filas;</w:t>
+            </w:r>
+            <w:r>
+              <w:t xml:space="preserve"> </w:t>
+            </w:r>
+            <w:r>
+              <w:rPr>
+                <w:i/>
+                <w:iCs/>
+              </w:rPr>
+              <w:t xml:space="preserve">EXPIRED</w:t>
+            </w:r>
+            <w:r>
+              <w:t xml:space="preserve"> </w:t>
+            </w:r>
+            <w:r>
+              <w:t xml:space="preserve">(semilla 112) solo lo usa el sistema y no aparece en la lista de motivos.</w:t>
             </w:r>
           </w:p>
         </w:tc>
@@ -10685,18 +11187,18 @@
               <w:pStyle w:val="Compact"/>
             </w:pPr>
             <w:r>
-              <w:t xml:space="preserve">execution.execution_status</w:t>
-            </w:r>
-          </w:p>
-        </w:tc>
-        <w:tc>
-          <w:tcPr/>
-          <w:p>
-            <w:pPr>
-              <w:pStyle w:val="Compact"/>
-            </w:pPr>
-            <w:r>
-              <w:t xml:space="preserve">5 filas: PENDING, IN_PROGRESS, PAUSED, COMPLETED y WITH_ISSUE.</w:t>
+              <w:t xml:space="preserve">booking.service_bay</w:t>
+            </w:r>
+          </w:p>
+        </w:tc>
+        <w:tc>
+          <w:tcPr/>
+          <w:p>
+            <w:pPr>
+              <w:pStyle w:val="Compact"/>
+            </w:pPr>
+            <w:r>
+              <w:t xml:space="preserve">4 bahías.</w:t>
             </w:r>
           </w:p>
         </w:tc>
@@ -10709,18 +11211,18 @@
               <w:pStyle w:val="Compact"/>
             </w:pPr>
             <w:r>
-              <w:t xml:space="preserve">payment.payment_status</w:t>
-            </w:r>
-          </w:p>
-        </w:tc>
-        <w:tc>
-          <w:tcPr/>
-          <w:p>
-            <w:pPr>
-              <w:pStyle w:val="Compact"/>
-            </w:pPr>
-            <w:r>
-              <w:t xml:space="preserve">5 filas; el identificador 3 corresponde a APPROVED.</w:t>
+              <w:t xml:space="preserve">execution.execution_status</w:t>
+            </w:r>
+          </w:p>
+        </w:tc>
+        <w:tc>
+          <w:tcPr/>
+          <w:p>
+            <w:pPr>
+              <w:pStyle w:val="Compact"/>
+            </w:pPr>
+            <w:r>
+              <w:t xml:space="preserve">5 filas: PENDING, IN_PROGRESS, PAUSED, COMPLETED y WITH_ISSUE.</w:t>
             </w:r>
           </w:p>
         </w:tc>
@@ -10733,18 +11235,18 @@
               <w:pStyle w:val="Compact"/>
             </w:pPr>
             <w:r>
-              <w:t xml:space="preserve">payment.payment_method_type</w:t>
-            </w:r>
-          </w:p>
-        </w:tc>
-        <w:tc>
-          <w:tcPr/>
-          <w:p>
-            <w:pPr>
-              <w:pStyle w:val="Compact"/>
-            </w:pPr>
-            <w:r>
-              <w:t xml:space="preserve">4 filas: EFECTIVO, NEQUI, DAVIPLATA y TRANSFERENCIA.</w:t>
+              <w:t xml:space="preserve">payment.payment_status</w:t>
+            </w:r>
+          </w:p>
+        </w:tc>
+        <w:tc>
+          <w:tcPr/>
+          <w:p>
+            <w:pPr>
+              <w:pStyle w:val="Compact"/>
+            </w:pPr>
+            <w:r>
+              <w:t xml:space="preserve">5 filas; el identificador 3 corresponde a APPROVED.</w:t>
             </w:r>
           </w:p>
         </w:tc>
@@ -10757,18 +11259,18 @@
               <w:pStyle w:val="Compact"/>
             </w:pPr>
             <w:r>
-              <w:t xml:space="preserve">payment.loyalty_movement_type</w:t>
-            </w:r>
-          </w:p>
-        </w:tc>
-        <w:tc>
-          <w:tcPr/>
-          <w:p>
-            <w:pPr>
-              <w:pStyle w:val="Compact"/>
-            </w:pPr>
-            <w:r>
-              <w:t xml:space="preserve">5 filas: EARNED, REDEEMED, EXPIRED, ADJUSTED y REVERSED.</w:t>
+              <w:t xml:space="preserve">payment.payment_method_type</w:t>
+            </w:r>
+          </w:p>
+        </w:tc>
+        <w:tc>
+          <w:tcPr/>
+          <w:p>
+            <w:pPr>
+              <w:pStyle w:val="Compact"/>
+            </w:pPr>
+            <w:r>
+              <w:t xml:space="preserve">4 filas: EFECTIVO, NEQUI, DAVIPLATA y TRANSFERENCIA.</w:t>
             </w:r>
           </w:p>
         </w:tc>
@@ -10781,6 +11283,30 @@
               <w:pStyle w:val="Compact"/>
             </w:pPr>
             <w:r>
+              <w:t xml:space="preserve">payment.loyalty_movement_type</w:t>
+            </w:r>
+          </w:p>
+        </w:tc>
+        <w:tc>
+          <w:tcPr/>
+          <w:p>
+            <w:pPr>
+              <w:pStyle w:val="Compact"/>
+            </w:pPr>
+            <w:r>
+              <w:t xml:space="preserve">5 filas: EARNED, REDEEMED, EXPIRED, ADJUSTED y REVERSED.</w:t>
+            </w:r>
+          </w:p>
+        </w:tc>
+      </w:tr>
+      <w:tr>
+        <w:tc>
+          <w:tcPr/>
+          <w:p>
+            <w:pPr>
+              <w:pStyle w:val="Compact"/>
+            </w:pPr>
+            <w:r>
               <w:t xml:space="preserve">notification.notification_type</w:t>
             </w:r>
           </w:p>
@@ -10792,7 +11318,7 @@
               <w:pStyle w:val="Compact"/>
             </w:pPr>
             <w:r>
-              <w:t xml:space="preserve">24 filas.</w:t>
+              <w:t xml:space="preserve">26 filas.</w:t>
             </w:r>
           </w:p>
         </w:tc>
@@ -10974,6 +11500,62 @@
     <w:p>
       <w:pPr>
         <w:pStyle w:val="FirstParagraph"/>
+      </w:pPr>
+      <w:r>
+        <w:t xml:space="preserve">En el servidor público los respaldos son automáticos:</w:t>
+      </w:r>
+      <w:r>
+        <w:t xml:space="preserve"> </w:t>
+      </w:r>
+      <w:r>
+        <w:rPr>
+          <w:i/>
+          <w:iCs/>
+        </w:rPr>
+        <w:t xml:space="preserve">deploy/backup-db.sh</w:t>
+      </w:r>
+      <w:r>
+        <w:t xml:space="preserve"> </w:t>
+      </w:r>
+      <w:r>
+        <w:t xml:space="preserve">respalda la base todos los días y antes de cada actualización,</w:t>
+      </w:r>
+      <w:r>
+        <w:t xml:space="preserve"> </w:t>
+      </w:r>
+      <w:r>
+        <w:rPr>
+          <w:i/>
+          <w:iCs/>
+        </w:rPr>
+        <w:t xml:space="preserve">deploy/verify-backup.sh</w:t>
+      </w:r>
+      <w:r>
+        <w:t xml:space="preserve"> </w:t>
+      </w:r>
+      <w:r>
+        <w:t xml:space="preserve">comprueba cada respaldo restaurándolo con otro nombre y</w:t>
+      </w:r>
+      <w:r>
+        <w:t xml:space="preserve"> </w:t>
+      </w:r>
+      <w:r>
+        <w:rPr>
+          <w:i/>
+          <w:iCs/>
+        </w:rPr>
+        <w:t xml:space="preserve">deploy/restore-db.sh</w:t>
+      </w:r>
+      <w:r>
+        <w:t xml:space="preserve"> </w:t>
+      </w:r>
+      <w:r>
+        <w:t xml:space="preserve">restaura uno (Documento de Despliegue, sección 3.2).</w:t>
+      </w:r>
+    </w:p>
+    <w:p>
+      <w:pPr>
+        <w:pStyle w:val="BodyText"/>
       </w:pPr>
       <w:r>
         <w:t xml:space="preserve">Para reiniciar un entorno local desechable, detener los contenedores y borrar los volúmenes.</w:t>
@@ -12805,7 +13387,7 @@
         <w:t xml:space="preserve">app.json</w:t>
       </w:r>
       <w:r>
-        <w:t xml:space="preserve">.</w:t>
+        <w:t xml:space="preserve">. Los cambios del 21 de octubre de 2026 (comprobante comprimido, lupa del QR y pantalla de actualización obligatoria del APK) no agregan dependencias nativas.</w:t>
       </w:r>
     </w:p>
     <w:p>
@@ -15294,7 +15876,39 @@
         <w:t xml:space="preserve">401</w:t>
       </w:r>
       <w:r>
-        <w:t xml:space="preserve">. El gateway no valida tokens (ADR-006): reenvía la solicitud y el servicio la rechaza. Todos los servicios, incluido payment-service, comprueban la base de datos en su endpoint de salud: si SQL Server no responde, contestan</w:t>
+        <w:t xml:space="preserve">. El gateway no verifica la firma de los tokens (ADR-006): una solicitud sin token pasa directo y la rechaza booking-service. Desde el 21 de octubre de 2026 el gateway sí corta el token de una sesión cerrada: después de cerrar sesión, repetir la llamada con el mismo token (</w:t>
+      </w:r>
+      <w:r>
+        <w:rPr>
+          <w:i/>
+          <w:iCs/>
+        </w:rPr>
+        <w:t xml:space="preserve">-H "Authorization: Bearer</w:t>
+      </w:r>
+      <w:r>
+        <w:rPr>
+          <w:i/>
+          <w:iCs/>
+        </w:rPr>
+        <w:t xml:space="preserve"> </w:t>
+      </w:r>
+      <w:r>
+        <w:rPr>
+          <w:rStyle w:val="VerbatimChar"/>
+          <w:i/>
+          <w:iCs/>
+        </w:rPr>
+        <w:t xml:space="preserve">&lt;TOKEN&gt;</w:t>
+      </w:r>
+      <w:r>
+        <w:rPr>
+          <w:i/>
+          <w:iCs/>
+        </w:rPr>
+        <w:t xml:space="preserve">"</w:t>
+      </w:r>
+      <w:r>
+        <w:t xml:space="preserve">) devuelve 401 desde el gateway, sin llegar al servicio. Todos los servicios, incluido payment-service, comprueban la base de datos en su endpoint de salud: si SQL Server no responde, contestan</w:t>
       </w:r>
       <w:r>
         <w:t xml:space="preserve"> </w:t>
@@ -15510,6 +16124,62 @@
         </w:numPr>
       </w:pPr>
       <w:r>
+        <w:t xml:space="preserve">Cerrar sesión y repetir una llamada con el mismo token: el gateway responde 401.</w:t>
+      </w:r>
+    </w:p>
+    <w:p>
+      <w:pPr>
+        <w:pStyle w:val="Compact"/>
+        <w:numPr>
+          <w:ilvl w:val="0"/>
+          <w:numId w:val="1021"/>
+        </w:numPr>
+      </w:pPr>
+      <w:r>
+        <w:t xml:space="preserve">Opcional: crear como administrador una reserva de prueba para una hora que termine pronto, con operario, y no iniciarla. Unos minutos después de su hora de fin debe aparecer en la tarjeta</w:t>
+      </w:r>
+      <w:r>
+        <w:t xml:space="preserve"> </w:t>
+      </w:r>
+      <w:r>
+        <w:rPr>
+          <w:b/>
+          <w:bCs/>
+        </w:rPr>
+        <w:t xml:space="preserve">Por cerrar</w:t>
+      </w:r>
+      <w:r>
+        <w:t xml:space="preserve"> </w:t>
+      </w:r>
+      <w:r>
+        <w:t xml:space="preserve">del inicio del administrador, con el aviso "Servicio sin registrar"; al hacer clic en</w:t>
+      </w:r>
+      <w:r>
+        <w:t xml:space="preserve"> </w:t>
+      </w:r>
+      <w:r>
+        <w:rPr>
+          <w:b/>
+          <w:bCs/>
+        </w:rPr>
+        <w:t xml:space="preserve">Se atendió</w:t>
+      </w:r>
+      <w:r>
+        <w:t xml:space="preserve"> </w:t>
+      </w:r>
+      <w:r>
+        <w:t xml:space="preserve">queda Completada.</w:t>
+      </w:r>
+    </w:p>
+    <w:p>
+      <w:pPr>
+        <w:pStyle w:val="Compact"/>
+        <w:numPr>
+          <w:ilvl w:val="0"/>
+          <w:numId w:val="1021"/>
+        </w:numPr>
+      </w:pPr>
+      <w:r>
         <w:t xml:space="preserve">Reiniciar los contenedores (</w:t>
       </w:r>
       <w:r>
@@ -16481,29 +17151,29 @@
               <w:pStyle w:val="Compact"/>
             </w:pPr>
             <w:r>
-              <w:t xml:space="preserve">503 CUSTOMER_SERVICE_UNAVAILABLE o BOOKING_SERVICE_UNAVAILABLE</w:t>
-            </w:r>
-          </w:p>
-        </w:tc>
-        <w:tc>
-          <w:tcPr/>
-          <w:p>
-            <w:pPr>
-              <w:pStyle w:val="Compact"/>
-            </w:pPr>
-            <w:r>
-              <w:t xml:space="preserve">El servicio llamado está caído.</w:t>
-            </w:r>
-          </w:p>
-        </w:tc>
-        <w:tc>
-          <w:tcPr/>
-          <w:p>
-            <w:pPr>
-              <w:pStyle w:val="Compact"/>
-            </w:pPr>
-            <w:r>
-              <w:t xml:space="preserve">Iniciar customer-service o booking-service.</w:t>
+              <w:t xml:space="preserve">401 justo después de cerrar sesión en otra pestaña o dispositivo</w:t>
+            </w:r>
+          </w:p>
+        </w:tc>
+        <w:tc>
+          <w:tcPr/>
+          <w:p>
+            <w:pPr>
+              <w:pStyle w:val="Compact"/>
+            </w:pPr>
+            <w:r>
+              <w:t xml:space="preserve">La sesión se cerró y el gateway corta su token.</w:t>
+            </w:r>
+          </w:p>
+        </w:tc>
+        <w:tc>
+          <w:tcPr/>
+          <w:p>
+            <w:pPr>
+              <w:pStyle w:val="Compact"/>
+            </w:pPr>
+            <w:r>
+              <w:t xml:space="preserve">Ingresar de nuevo.</w:t>
             </w:r>
           </w:p>
         </w:tc>
@@ -16516,29 +17186,39 @@
               <w:pStyle w:val="Compact"/>
             </w:pPr>
             <w:r>
-              <w:t xml:space="preserve">"Tu perfil de cliente aún no está listo"</w:t>
-            </w:r>
-          </w:p>
-        </w:tc>
-        <w:tc>
-          <w:tcPr/>
-          <w:p>
-            <w:pPr>
-              <w:pStyle w:val="Compact"/>
-            </w:pPr>
-            <w:r>
-              <w:t xml:space="preserve">El perfil del cliente no se ha creado (evento no consumido).</w:t>
-            </w:r>
-          </w:p>
-        </w:tc>
-        <w:tc>
-          <w:tcPr/>
-          <w:p>
-            <w:pPr>
-              <w:pStyle w:val="Compact"/>
-            </w:pPr>
-            <w:r>
-              <w:t xml:space="preserve">Esperar y reintentar; con MESSAGING_ENABLED=true revisar la cola de customer-service.</w:t>
+              <w:t xml:space="preserve">Las solicitudes tardan unos 3 segundos más y el registro del gateway dice</w:t>
+            </w:r>
+            <w:r>
+              <w:t xml:space="preserve"> </w:t>
+            </w:r>
+            <w:r>
+              <w:rPr>
+                <w:i/>
+                <w:iCs/>
+              </w:rPr>
+              <w:t xml:space="preserve">No se pudo confirmar la sesión</w:t>
+            </w:r>
+          </w:p>
+        </w:tc>
+        <w:tc>
+          <w:tcPr/>
+          <w:p>
+            <w:pPr>
+              <w:pStyle w:val="Compact"/>
+            </w:pPr>
+            <w:r>
+              <w:t xml:space="preserve">security-service no responde; el gateway deja pasar la solicitud después de esperarlo.</w:t>
+            </w:r>
+          </w:p>
+        </w:tc>
+        <w:tc>
+          <w:tcPr/>
+          <w:p>
+            <w:pPr>
+              <w:pStyle w:val="Compact"/>
+            </w:pPr>
+            <w:r>
+              <w:t xml:space="preserve">Iniciar security-service y revisar su salud.</w:t>
             </w:r>
           </w:p>
         </w:tc>
@@ -16551,29 +17231,29 @@
               <w:pStyle w:val="Compact"/>
             </w:pPr>
             <w:r>
-              <w:t xml:space="preserve">Los correos no llegan a Mailpit</w:t>
-            </w:r>
-          </w:p>
-        </w:tc>
-        <w:tc>
-          <w:tcPr/>
-          <w:p>
-            <w:pPr>
-              <w:pStyle w:val="Compact"/>
-            </w:pPr>
-            <w:r>
-              <w:t xml:space="preserve">MAIL_ENABLED=false o host o puerto equivocados.</w:t>
-            </w:r>
-          </w:p>
-        </w:tc>
-        <w:tc>
-          <w:tcPr/>
-          <w:p>
-            <w:pPr>
-              <w:pStyle w:val="Compact"/>
-            </w:pPr>
-            <w:r>
-              <w:t xml:space="preserve">MAIL_HOST=localhost y MAIL_PORT=1025 en el anfitrión; MAIL_DOCKER_HOST=mailpit en Docker.</w:t>
+              <w:t xml:space="preserve">503 CUSTOMER_SERVICE_UNAVAILABLE o BOOKING_SERVICE_UNAVAILABLE</w:t>
+            </w:r>
+          </w:p>
+        </w:tc>
+        <w:tc>
+          <w:tcPr/>
+          <w:p>
+            <w:pPr>
+              <w:pStyle w:val="Compact"/>
+            </w:pPr>
+            <w:r>
+              <w:t xml:space="preserve">El servicio llamado está caído.</w:t>
+            </w:r>
+          </w:p>
+        </w:tc>
+        <w:tc>
+          <w:tcPr/>
+          <w:p>
+            <w:pPr>
+              <w:pStyle w:val="Compact"/>
+            </w:pPr>
+            <w:r>
+              <w:t xml:space="preserve">Iniciar customer-service o booking-service.</w:t>
             </w:r>
           </w:p>
         </w:tc>
@@ -16586,6 +17266,76 @@
               <w:pStyle w:val="Compact"/>
             </w:pPr>
             <w:r>
+              <w:t xml:space="preserve">"Tu perfil de cliente aún no está listo"</w:t>
+            </w:r>
+          </w:p>
+        </w:tc>
+        <w:tc>
+          <w:tcPr/>
+          <w:p>
+            <w:pPr>
+              <w:pStyle w:val="Compact"/>
+            </w:pPr>
+            <w:r>
+              <w:t xml:space="preserve">El perfil del cliente no se ha creado (evento no consumido).</w:t>
+            </w:r>
+          </w:p>
+        </w:tc>
+        <w:tc>
+          <w:tcPr/>
+          <w:p>
+            <w:pPr>
+              <w:pStyle w:val="Compact"/>
+            </w:pPr>
+            <w:r>
+              <w:t xml:space="preserve">Esperar y reintentar; con MESSAGING_ENABLED=true revisar la cola de customer-service.</w:t>
+            </w:r>
+          </w:p>
+        </w:tc>
+      </w:tr>
+      <w:tr>
+        <w:tc>
+          <w:tcPr/>
+          <w:p>
+            <w:pPr>
+              <w:pStyle w:val="Compact"/>
+            </w:pPr>
+            <w:r>
+              <w:t xml:space="preserve">Los correos no llegan a Mailpit</w:t>
+            </w:r>
+          </w:p>
+        </w:tc>
+        <w:tc>
+          <w:tcPr/>
+          <w:p>
+            <w:pPr>
+              <w:pStyle w:val="Compact"/>
+            </w:pPr>
+            <w:r>
+              <w:t xml:space="preserve">MAIL_ENABLED=false o host o puerto equivocados.</w:t>
+            </w:r>
+          </w:p>
+        </w:tc>
+        <w:tc>
+          <w:tcPr/>
+          <w:p>
+            <w:pPr>
+              <w:pStyle w:val="Compact"/>
+            </w:pPr>
+            <w:r>
+              <w:t xml:space="preserve">MAIL_HOST=localhost y MAIL_PORT=1025 en el anfitrión; MAIL_DOCKER_HOST=mailpit en Docker.</w:t>
+            </w:r>
+          </w:p>
+        </w:tc>
+      </w:tr>
+      <w:tr>
+        <w:tc>
+          <w:tcPr/>
+          <w:p>
+            <w:pPr>
+              <w:pStyle w:val="Compact"/>
+            </w:pPr>
+            <w:r>
               <w:t xml:space="preserve">No llegan los correos de reservas, pagos ni los recordatorios</w:t>
             </w:r>
           </w:p>
@@ -16609,6 +17359,67 @@
             </w:pPr>
             <w:r>
               <w:t xml:space="preserve">Generar la llave y reiniciar security-service y notification-service.</w:t>
+            </w:r>
+          </w:p>
+        </w:tc>
+      </w:tr>
+      <w:tr>
+        <w:tc>
+          <w:tcPr/>
+          <w:p>
+            <w:pPr>
+              <w:pStyle w:val="Compact"/>
+            </w:pPr>
+            <w:r>
+              <w:t xml:space="preserve">Las reservas que terminaron no aparecen en "Por cerrar" o las que no tenían operario no pasan a No asistió</w:t>
+            </w:r>
+          </w:p>
+        </w:tc>
+        <w:tc>
+          <w:tcPr/>
+          <w:p>
+            <w:pPr>
+              <w:pStyle w:val="Compact"/>
+            </w:pPr>
+            <w:r>
+              <w:t xml:space="preserve">FOLLOW_UP_ENABLED=false, INTERNAL_API_KEY vacía o booking-service caído.</w:t>
+            </w:r>
+          </w:p>
+        </w:tc>
+        <w:tc>
+          <w:tcPr/>
+          <w:p>
+            <w:pPr>
+              <w:pStyle w:val="Compact"/>
+            </w:pPr>
+            <w:r>
+              <w:t xml:space="preserve">Revisar el registro de operations-service (</w:t>
+            </w:r>
+            <w:r>
+              <w:rPr>
+                <w:i/>
+                <w:iCs/>
+              </w:rPr>
+              <w:t xml:space="preserve">Could not follow up finished bookings</w:t>
+            </w:r>
+            <w:r>
+              <w:t xml:space="preserve"> </w:t>
+            </w:r>
+            <w:r>
+              <w:t xml:space="preserve">o</w:t>
+            </w:r>
+            <w:r>
+              <w:t xml:space="preserve"> </w:t>
+            </w:r>
+            <w:r>
+              <w:rPr>
+                <w:i/>
+                <w:iCs/>
+              </w:rPr>
+              <w:t xml:space="preserve">was not closed as not attended</w:t>
+            </w:r>
+            <w:r>
+              <w:t xml:space="preserve">) y la llave interna.</w:t>
             </w:r>
           </w:p>
         </w:tc>
@@ -17009,7 +17820,7 @@
               <w:pStyle w:val="Compact"/>
             </w:pPr>
             <w:r>
-              <w:t xml:space="preserve">Punto de entrada único que enruta las solicitudes a los servicios; no valida tokens.</w:t>
+              <w:t xml:space="preserve">Punto de entrada único que enruta las solicitudes a los servicios; no verifica la firma de los tokens, pero desde el 21 de octubre de 2026 corta los de sesiones cerradas.</w:t>
             </w:r>
           </w:p>
         </w:tc>
@@ -17775,6 +18586,112 @@
             </w:pPr>
             <w:r>
               <w:t xml:space="preserve">11.4</w:t>
+            </w:r>
+          </w:p>
+        </w:tc>
+      </w:tr>
+      <w:tr>
+        <w:tc>
+          <w:tcPr/>
+          <w:p>
+            <w:pPr>
+              <w:pStyle w:val="Compact"/>
+            </w:pPr>
+            <w:r>
+              <w:t xml:space="preserve">Variables del 21 de octubre de 2026</w:t>
+            </w:r>
+          </w:p>
+        </w:tc>
+        <w:tc>
+          <w:tcPr/>
+          <w:p>
+            <w:pPr>
+              <w:pStyle w:val="Compact"/>
+            </w:pPr>
+            <w:r>
+              <w:rPr>
+                <w:i/>
+                <w:iCs/>
+              </w:rPr>
+              <w:t xml:space="preserve">SESSION_CHECK_*</w:t>
+            </w:r>
+            <w:r>
+              <w:t xml:space="preserve">,</w:t>
+            </w:r>
+            <w:r>
+              <w:t xml:space="preserve"> </w:t>
+            </w:r>
+            <w:r>
+              <w:rPr>
+                <w:i/>
+                <w:iCs/>
+              </w:rPr>
+              <w:t xml:space="preserve">BOOKING_EXPIRY_*</w:t>
+            </w:r>
+            <w:r>
+              <w:t xml:space="preserve"> </w:t>
+            </w:r>
+            <w:r>
+              <w:t xml:space="preserve">y</w:t>
+            </w:r>
+            <w:r>
+              <w:t xml:space="preserve"> </w:t>
+            </w:r>
+            <w:r>
+              <w:rPr>
+                <w:i/>
+                <w:iCs/>
+              </w:rPr>
+              <w:t xml:space="preserve">FOLLOW_UP_*</w:t>
+            </w:r>
+            <w:r>
+              <w:t xml:space="preserve"> </w:t>
+            </w:r>
+            <w:r>
+              <w:t xml:space="preserve">no están en</w:t>
+            </w:r>
+            <w:r>
+              <w:t xml:space="preserve"> </w:t>
+            </w:r>
+            <w:r>
+              <w:rPr>
+                <w:i/>
+                <w:iCs/>
+              </w:rPr>
+              <w:t xml:space="preserve">.env.example</w:t>
+            </w:r>
+            <w:r>
+              <w:t xml:space="preserve"> </w:t>
+            </w:r>
+            <w:r>
+              <w:t xml:space="preserve">ni en</w:t>
+            </w:r>
+            <w:r>
+              <w:t xml:space="preserve"> </w:t>
+            </w:r>
+            <w:r>
+              <w:rPr>
+                <w:i/>
+                <w:iCs/>
+              </w:rPr>
+              <w:t xml:space="preserve">docker-compose.yml</w:t>
+            </w:r>
+            <w:r>
+              <w:t xml:space="preserve"> </w:t>
+            </w:r>
+            <w:r>
+              <w:t xml:space="preserve">(acción ACO-14).</w:t>
+            </w:r>
+          </w:p>
+        </w:tc>
+        <w:tc>
+          <w:tcPr/>
+          <w:p>
+            <w:pPr>
+              <w:pStyle w:val="Compact"/>
+            </w:pPr>
+            <w:r>
+              <w:t xml:space="preserve">10.2</w:t>
             </w:r>
           </w:p>
         </w:tc>

</xml_diff>